<commit_message>
Neue Publikation: Lay People Deny Morality’s Objectivity across Cultures (forthcoming, RoPP) – Website und CV
Co-Authored-By: Claude Opus 5.5 <noreply@anthropic.com>
Claude-Session: https://claude.ai/code/session_01T6qL9Nf94VqDwvmhDVCsFq
</commit_message>
<xml_diff>
--- a/cv/CV_Thomas_Poelzler.docx
+++ b/cv/CV_Thomas_Poelzler.docx
@@ -1209,7 +1209,30 @@
       <w:r>
         <w:t xml:space="preserve">Journal Articles</w:t>
         <w:tab/>
-        <w:t xml:space="preserve">[1] Pölzler, Thomas (2025): How to Do Empirical Political Philosophy: A Case Study of Miller’s Argument for Needs-Based Justice. </w:t>
+        <w:t xml:space="preserve">[1] Pölzler, Thomas; Tomabechi, Tobu; Suzuki, Takayuki (forthcoming): Lay People Deny Morality’s Objectivity across Cultures (to somewhat Different Extents and in somewhat Different Ways). </w:t>
+      </w:r>
+      <w:r>
+        <w:rPr>
+          <w:i/>
+          <w:iCs/>
+        </w:rPr>
+        <w:t xml:space="preserve">Review of Philosophy and Psychology</w:t>
+      </w:r>
+      <w:r>
+        <w:t xml:space="preserve">.</w:t>
+      </w:r>
+    </w:p>
+    <w:p>
+      <w:pPr>
+        <w:tabs>
+          <w:tab w:val="left" w:pos="2126"/>
+        </w:tabs>
+        <w:spacing w:before="240" w:after="0" w:line="288" w:lineRule="auto"/>
+        <w:ind w:left="2126" w:hanging="2126"/>
+      </w:pPr>
+      <w:r>
+        <w:tab/>
+        <w:t xml:space="preserve">[2] Pölzler, Thomas (2025): How to Do Empirical Political Philosophy: A Case Study of Miller’s Argument for Needs-Based Justice. </w:t>
       </w:r>
       <w:r>
         <w:rPr>
@@ -1232,7 +1255,7 @@
       </w:pPr>
       <w:r>
         <w:tab/>
-        <w:t xml:space="preserve">[2] Pölzler, Thomas; Tomabechi, Tobu; Hannikainen, Ivar R. (2024): Broad, Subjective, Relative: The Surprising Folk Concept of Basic Needs. </w:t>
+        <w:t xml:space="preserve">[3] Pölzler, Thomas; Tomabechi, Tobu; Hannikainen, Ivar R. (2024): Broad, Subjective, Relative: The Surprising Folk Concept of Basic Needs. </w:t>
       </w:r>
       <w:r>
         <w:rPr>
@@ -1255,7 +1278,7 @@
       </w:pPr>
       <w:r>
         <w:tab/>
-        <w:t xml:space="preserve">[3] Pölzler, Thomas; Zijlstra, Lieuwe; Dijkstra, Jacob (2024): Moral Progress, Knowledge and Error: Do People Believe in Moral Objectivity? </w:t>
+        <w:t xml:space="preserve">[4] Pölzler, Thomas; Zijlstra, Lieuwe; Dijkstra, Jacob (2024): Moral Progress, Knowledge and Error: Do People Believe in Moral Objectivity? </w:t>
       </w:r>
       <w:r>
         <w:rPr>
@@ -1278,7 +1301,7 @@
       </w:pPr>
       <w:r>
         <w:tab/>
-        <w:t xml:space="preserve">[4] Pölzler, Thomas; Paulo, Norbert (2024): Thought Experiments and Experimental Ethics. </w:t>
+        <w:t xml:space="preserve">[5] Pölzler, Thomas; Paulo, Norbert (2024): Thought Experiments and Experimental Ethics. </w:t>
       </w:r>
       <w:r>
         <w:rPr>
@@ -1313,7 +1336,7 @@
       </w:pPr>
       <w:r>
         <w:tab/>
-        <w:t xml:space="preserve">[5] Wagner, Johannes; Pölzler, Thomas; Wright, Jennifer C. (2023): Implicit Metaethical Intuitions: Validating and Employing a New IAT Procedure. </w:t>
+        <w:t xml:space="preserve">[6] Wagner, Johannes; Pölzler, Thomas; Wright, Jennifer C. (2023): Implicit Metaethical Intuitions: Validating and Employing a New IAT Procedure. </w:t>
       </w:r>
       <w:r>
         <w:rPr>
@@ -1336,7 +1359,7 @@
       </w:pPr>
       <w:r>
         <w:tab/>
-        <w:t xml:space="preserve">[6] Pölzler, Thomas; Wright, Jennifer C. (2023): An Empirical Argument against Moral Non-Cognitivism. </w:t>
+        <w:t xml:space="preserve">[7] Pölzler, Thomas; Wright, Jennifer C. (2023): An Empirical Argument against Moral Non-Cognitivism. </w:t>
       </w:r>
       <w:r>
         <w:rPr>
@@ -1359,7 +1382,7 @@
       </w:pPr>
       <w:r>
         <w:tab/>
-        <w:t xml:space="preserve">[7] Pölzler, Thomas; Hannikainen, Ivar R. (2022): The Typicality Effect in Basic Needs. </w:t>
+        <w:t xml:space="preserve">[8] Pölzler, Thomas; Hannikainen, Ivar R. (2022): The Typicality Effect in Basic Needs. </w:t>
       </w:r>
       <w:r>
         <w:rPr>
@@ -1382,7 +1405,7 @@
       </w:pPr>
       <w:r>
         <w:tab/>
-        <w:t xml:space="preserve">[8] Pölzler, Thomas; Ortner, Florian; Meyer, Lukas; Sass, Oliver; Hofer, Miriam (2022): Natural Hazards under Climate Change Conditions: A Case Study of Expectations and their Normative Significance in Protecting Alpine Communities. </w:t>
+        <w:t xml:space="preserve">[9] Pölzler, Thomas; Ortner, Florian; Meyer, Lukas; Sass, Oliver; Hofer, Miriam (2022): Natural Hazards under Climate Change Conditions: A Case Study of Expectations and their Normative Significance in Protecting Alpine Communities. </w:t>
       </w:r>
       <w:r>
         <w:rPr>
@@ -1405,7 +1428,7 @@
       </w:pPr>
       <w:r>
         <w:tab/>
-        <w:t xml:space="preserve">[9] Wright, Jennifer C.; Pölzler, Thomas (2022): Should Morality be Abolished? An Empirical Challenge to the Argument from Intolerance. </w:t>
+        <w:t xml:space="preserve">[10] Wright, Jennifer C.; Pölzler, Thomas (2022): Should Morality be Abolished? An Empirical Challenge to the Argument from Intolerance. </w:t>
       </w:r>
       <w:r>
         <w:rPr>
@@ -1428,7 +1451,7 @@
       </w:pPr>
       <w:r>
         <w:tab/>
-        <w:t xml:space="preserve">[10] Pölzler, Thomas (2021): The Relativistic Car: Applying Metaethics to the Debate about Self-Driving Vehicles. </w:t>
+        <w:t xml:space="preserve">[11] Pölzler, Thomas (2021): The Relativistic Car: Applying Metaethics to the Debate about Self-Driving Vehicles. </w:t>
       </w:r>
       <w:r>
         <w:rPr>
@@ -1451,7 +1474,7 @@
       </w:pPr>
       <w:r>
         <w:tab/>
-        <w:t xml:space="preserve">[11] Pölzler, Thomas (2021): Basic Needs in Normative Contexts. </w:t>
+        <w:t xml:space="preserve">[12] Pölzler, Thomas (2021): Basic Needs in Normative Contexts. </w:t>
       </w:r>
       <w:r>
         <w:rPr>
@@ -1486,7 +1509,7 @@
       </w:pPr>
       <w:r>
         <w:tab/>
-        <w:t xml:space="preserve">[12] Pölzler, Thomas (2020): Against Overgeneralization Objections to the Argument from Moral Disagreement. </w:t>
+        <w:t xml:space="preserve">[13] Pölzler, Thomas (2020): Against Overgeneralization Objections to the Argument from Moral Disagreement. </w:t>
       </w:r>
       <w:r>
         <w:rPr>
@@ -1509,7 +1532,7 @@
       </w:pPr>
       <w:r>
         <w:tab/>
-        <w:t xml:space="preserve">[13] Paulo, Norbert; Pölzler, Thomas (2020): X-Phi and Impartiality Thought Experiments: Investigating the Veil of Ignorance. </w:t>
+        <w:t xml:space="preserve">[14] Paulo, Norbert; Pölzler, Thomas (2020): X-Phi and Impartiality Thought Experiments: Investigating the Veil of Ignorance. </w:t>
       </w:r>
       <w:r>
         <w:rPr>
@@ -1532,7 +1555,7 @@
       </w:pPr>
       <w:r>
         <w:tab/>
-        <w:t xml:space="preserve">[14] Pölzler, Thomas; Wright, Jennifer C. (2020): Anti-Realist Pluralism: A New Approach to Folk Metaethics. </w:t>
+        <w:t xml:space="preserve">[15] Pölzler, Thomas; Wright, Jennifer C. (2020): Anti-Realist Pluralism: A New Approach to Folk Metaethics. </w:t>
       </w:r>
       <w:r>
         <w:rPr>
@@ -1555,7 +1578,7 @@
       </w:pPr>
       <w:r>
         <w:tab/>
-        <w:t xml:space="preserve">[15] Pölzler, Thomas (2020): Camus on the Value of Art. </w:t>
+        <w:t xml:space="preserve">[16] Pölzler, Thomas (2020): Camus on the Value of Art. </w:t>
       </w:r>
       <w:r>
         <w:rPr>
@@ -1590,7 +1613,7 @@
       </w:pPr>
       <w:r>
         <w:tab/>
-        <w:t xml:space="preserve">[16] Pölzler, Thomas; Wright, Jennifer C. (2019): Empirical Research on Folk Moral Objectivism. </w:t>
+        <w:t xml:space="preserve">[17] Pölzler, Thomas; Wright, Jennifer C. (2019): Empirical Research on Folk Moral Objectivism. </w:t>
       </w:r>
       <w:r>
         <w:rPr>
@@ -1613,7 +1636,7 @@
       </w:pPr>
       <w:r>
         <w:tab/>
-        <w:t xml:space="preserve">[17] Pölzler, Thomas (2019): Open Borders and the Ideality of Approaches: An Analysis of Joseph Carens’ Critique of the Conventional View regarding Immigration. </w:t>
+        <w:t xml:space="preserve">[18] Pölzler, Thomas (2019): Open Borders and the Ideality of Approaches: An Analysis of Joseph Carens’ Critique of the Conventional View regarding Immigration. </w:t>
       </w:r>
       <w:r>
         <w:rPr>
@@ -1636,7 +1659,7 @@
       </w:pPr>
       <w:r>
         <w:tab/>
-        <w:t xml:space="preserve">[18] Pölzler, Thomas (2019): How to Determine whether Evolution Debunks Moral Realism. </w:t>
+        <w:t xml:space="preserve">[19] Pölzler, Thomas (2019): How to Determine whether Evolution Debunks Moral Realism. </w:t>
       </w:r>
       <w:r>
         <w:rPr>
@@ -1659,7 +1682,7 @@
       </w:pPr>
       <w:r>
         <w:tab/>
-        <w:t xml:space="preserve">[19] Pölzler, Thomas (2018): Entschädigung für historisches Unrecht: Das Argument des anhaltenden Unrechts. </w:t>
+        <w:t xml:space="preserve">[20] Pölzler, Thomas (2018): Entschädigung für historisches Unrecht: Das Argument des anhaltenden Unrechts. </w:t>
       </w:r>
       <w:r>
         <w:rPr>
@@ -1682,7 +1705,7 @@
       </w:pPr>
       <w:r>
         <w:tab/>
-        <w:t xml:space="preserve">[20] Pölzler, Thomas (2018): How to Measure Moral Realism. </w:t>
+        <w:t xml:space="preserve">[21] Pölzler, Thomas (2018): How to Measure Moral Realism. </w:t>
       </w:r>
       <w:r>
         <w:rPr>
@@ -1705,7 +1728,7 @@
       </w:pPr>
       <w:r>
         <w:tab/>
-        <w:t xml:space="preserve">[21] Pölzler, Thomas (2018): Can the Empirical Sciences Contribute to the Moral Realism/Anti-Realism Debate? </w:t>
+        <w:t xml:space="preserve">[22] Pölzler, Thomas (2018): Can the Empirical Sciences Contribute to the Moral Realism/Anti-Realism Debate? </w:t>
       </w:r>
       <w:r>
         <w:rPr>
@@ -1728,7 +1751,7 @@
       </w:pPr>
       <w:r>
         <w:tab/>
-        <w:t xml:space="preserve">[22] Pölzler, Thomas (2018): Camus’ Feeling of the Absurd. </w:t>
+        <w:t xml:space="preserve">[23] Pölzler, Thomas (2018): Camus’ Feeling of the Absurd. </w:t>
       </w:r>
       <w:r>
         <w:rPr>
@@ -1751,7 +1774,7 @@
       </w:pPr>
       <w:r>
         <w:tab/>
-        <w:t xml:space="preserve">[23] Pölzler, Thomas (2017): On the Contribution of Philosophical and Geoscientific Inquiry to Geoethics (</w:t>
+        <w:t xml:space="preserve">[24] Pölzler, Thomas (2017): On the Contribution of Philosophical and Geoscientific Inquiry to Geoethics (</w:t>
       </w:r>
       <w:r>
         <w:rPr>
@@ -1784,7 +1807,7 @@
       </w:pPr>
       <w:r>
         <w:tab/>
-        <w:t xml:space="preserve">[24] Pölzler, Thomas; Ortner, Florian (2017): Ethical but Upsetting Geoscience Research: A Case Study. </w:t>
+        <w:t xml:space="preserve">[25] Pölzler, Thomas; Ortner, Florian (2017): Ethical but Upsetting Geoscience Research: A Case Study. </w:t>
       </w:r>
       <w:r>
         <w:rPr>
@@ -1807,7 +1830,7 @@
       </w:pPr>
       <w:r>
         <w:tab/>
-        <w:t xml:space="preserve">[25] Pölzler, Thomas (2017): Are Moral Judgements Adaptations? Three Reasons Why It Is so Difficult to Tell. </w:t>
+        <w:t xml:space="preserve">[26] Pölzler, Thomas (2017): Are Moral Judgements Adaptations? Three Reasons Why It Is so Difficult to Tell. </w:t>
       </w:r>
       <w:r>
         <w:rPr>
@@ -1830,7 +1853,7 @@
       </w:pPr>
       <w:r>
         <w:tab/>
-        <w:t xml:space="preserve">[26] Pölzler, Thomas (2017): Revisiting Folk Moral Realism. </w:t>
+        <w:t xml:space="preserve">[27] Pölzler, Thomas (2017): Revisiting Folk Moral Realism. </w:t>
       </w:r>
       <w:r>
         <w:rPr>
@@ -1853,7 +1876,7 @@
       </w:pPr>
       <w:r>
         <w:tab/>
-        <w:t xml:space="preserve">[27] Pölzler, Thomas (2016): Further Problems with Projectivism. </w:t>
+        <w:t xml:space="preserve">[28] Pölzler, Thomas (2016): Further Problems with Projectivism. </w:t>
       </w:r>
       <w:r>
         <w:rPr>
@@ -1876,7 +1899,7 @@
       </w:pPr>
       <w:r>
         <w:tab/>
-        <w:t xml:space="preserve">[28] Pölzler, Thomas (2016): Wie schlüssig ist Albert Camus’ frühe Logik des Absurden? </w:t>
+        <w:t xml:space="preserve">[29] Pölzler, Thomas (2016): Wie schlüssig ist Albert Camus’ frühe Logik des Absurden? </w:t>
       </w:r>
       <w:r>
         <w:rPr>
@@ -1899,7 +1922,7 @@
       </w:pPr>
       <w:r>
         <w:tab/>
-        <w:t xml:space="preserve">[29] Pölzler, Thomas (2015): Moral Judgements and Emotions: A Less Intimate Relationship than Recently Claimed. </w:t>
+        <w:t xml:space="preserve">[30] Pölzler, Thomas (2015): Moral Judgements and Emotions: A Less Intimate Relationship than Recently Claimed. </w:t>
       </w:r>
       <w:r>
         <w:rPr>
@@ -1922,7 +1945,7 @@
       </w:pPr>
       <w:r>
         <w:tab/>
-        <w:t xml:space="preserve">[30] Pölzler, Thomas (2015): Climate Change Inaction and Moral Nihilism. </w:t>
+        <w:t xml:space="preserve">[31] Pölzler, Thomas (2015): Climate Change Inaction and Moral Nihilism. </w:t>
       </w:r>
       <w:r>
         <w:rPr>
@@ -1945,7 +1968,7 @@
       </w:pPr>
       <w:r>
         <w:tab/>
-        <w:t xml:space="preserve">[31] Pölzler, Thomas (2014): Absurdism as Self-Help: Resolving an Essential Inconsistency in Camus’ Early Philosophy. </w:t>
+        <w:t xml:space="preserve">[32] Pölzler, Thomas (2014): Absurdism as Self-Help: Resolving an Essential Inconsistency in Camus’ Early Philosophy. </w:t>
       </w:r>
       <w:r>
         <w:rPr>
@@ -1968,7 +1991,7 @@
       </w:pPr>
       <w:r>
         <w:tab/>
-        <w:t xml:space="preserve">[32] Pölzler, Thomas (2011): Camus’ Early “Logic of the Absurd”. </w:t>
+        <w:t xml:space="preserve">[33] Pölzler, Thomas (2011): Camus’ Early “Logic of the Absurd”. </w:t>
       </w:r>
       <w:r>
         <w:rPr>

</xml_diff>

<commit_message>
Einzelseiten der Papers entfernt (Weiterleitung auf /research/papers); Haidt-Rezension (Der Standard) auf Website und im CV
Co-Authored-By: Claude Opus 5.5 <noreply@anthropic.com>
Claude-Session: https://claude.ai/code/session_01T6qL9Nf94VqDwvmhDVCsFq
</commit_message>
<xml_diff>
--- a/cv/CV_Thomas_Poelzler.docx
+++ b/cv/CV_Thomas_Poelzler.docx
@@ -2620,7 +2620,7 @@
       <w:r>
         <w:t xml:space="preserve">Science to Public</w:t>
         <w:tab/>
-        <w:t xml:space="preserve">[1] Pölzler, Thomas (2026): Analyse eines Betroffenen: ME/CFS und die Erfahrungen mit Ärzten und Gesundheitssystem. </w:t>
+        <w:t xml:space="preserve">[1] Pölzler, Thomas (2026): War es falsch miteinander zu schlafen? Jonathan Haidt hat über die Macht der Moral geschrieben. </w:t>
       </w:r>
       <w:r>
         <w:rPr>
@@ -2630,6 +2630,29 @@
         <w:t xml:space="preserve">Der Standard</w:t>
       </w:r>
       <w:r>
+        <w:t xml:space="preserve">, 10/26/2026.</w:t>
+      </w:r>
+    </w:p>
+    <w:p>
+      <w:pPr>
+        <w:tabs>
+          <w:tab w:val="left" w:pos="2126"/>
+        </w:tabs>
+        <w:spacing w:before="240" w:after="0" w:line="288" w:lineRule="auto"/>
+        <w:ind w:left="2126" w:hanging="2126"/>
+      </w:pPr>
+      <w:r>
+        <w:tab/>
+        <w:t xml:space="preserve">[2] Pölzler, Thomas (2026): Analyse eines Betroffenen: ME/CFS und die Erfahrungen mit Ärzten und Gesundheitssystem. </w:t>
+      </w:r>
+      <w:r>
+        <w:rPr>
+          <w:i/>
+          <w:iCs/>
+        </w:rPr>
+        <w:t xml:space="preserve">Der Standard</w:t>
+      </w:r>
+      <w:r>
         <w:t xml:space="preserve">, 03/15/2026.</w:t>
       </w:r>
     </w:p>
@@ -2643,7 +2666,7 @@
       </w:pPr>
       <w:r>
         <w:tab/>
-        <w:t xml:space="preserve">[2] Pölzler, Thomas (2026): Wieso Meursault? Ein Mord als Lehrstück des Absurden. Philosophy Blog </w:t>
+        <w:t xml:space="preserve">[3] Pölzler, Thomas (2026): Wieso Meursault? Ein Mord als Lehrstück des Absurden. Philosophy Blog </w:t>
       </w:r>
       <w:r>
         <w:rPr>
@@ -2666,7 +2689,7 @@
       </w:pPr>
       <w:r>
         <w:tab/>
-        <w:t xml:space="preserve">[3] Pölzler, Thomas (2026): Von oben betrachtet: Hanno Sauers Buch über Gesellschaft und Klasse. </w:t>
+        <w:t xml:space="preserve">[4] Pölzler, Thomas (2026): Von oben betrachtet: Hanno Sauers Buch über Gesellschaft und Klasse. </w:t>
       </w:r>
       <w:r>
         <w:rPr>
@@ -2689,7 +2712,7 @@
       </w:pPr>
       <w:r>
         <w:tab/>
-        <w:t xml:space="preserve">[4] Pölzler, Thomas (2023): Biodiversität und Ethik. </w:t>
+        <w:t xml:space="preserve">[5] Pölzler, Thomas (2023): Biodiversität und Ethik. </w:t>
       </w:r>
       <w:r>
         <w:rPr>
@@ -2712,7 +2735,7 @@
       </w:pPr>
       <w:r>
         <w:tab/>
-        <w:t xml:space="preserve">[5] Pölzler, Thomas (2023): Kurzinterview Thomas Pölzler. </w:t>
+        <w:t xml:space="preserve">[6] Pölzler, Thomas (2023): Kurzinterview Thomas Pölzler. </w:t>
       </w:r>
       <w:r>
         <w:rPr>
@@ -2735,7 +2758,7 @@
       </w:pPr>
       <w:r>
         <w:tab/>
-        <w:t xml:space="preserve">[6] Pölzler, Thomas (2022): My Research Life. </w:t>
+        <w:t xml:space="preserve">[7] Pölzler, Thomas (2022): My Research Life. </w:t>
       </w:r>
       <w:r>
         <w:rPr>
@@ -2758,7 +2781,7 @@
       </w:pPr>
       <w:r>
         <w:tab/>
-        <w:t xml:space="preserve">[7] Pölzler, Thomas (2022): Interview „Hilft besser zu denken und besser zu handeln“. </w:t>
+        <w:t xml:space="preserve">[8] Pölzler, Thomas (2022): Interview „Hilft besser zu denken und besser zu handeln“. </w:t>
       </w:r>
       <w:r>
         <w:rPr>
@@ -2781,7 +2804,7 @@
       </w:pPr>
       <w:r>
         <w:tab/>
-        <w:t xml:space="preserve">[8] Pölzler, Thomas (2022): Experteninterview zum Thema moralische Entwicklung. </w:t>
+        <w:t xml:space="preserve">[9] Pölzler, Thomas (2022): Experteninterview zum Thema moralische Entwicklung. </w:t>
       </w:r>
       <w:r>
         <w:rPr>
@@ -2804,7 +2827,7 @@
       </w:pPr>
       <w:r>
         <w:tab/>
-        <w:t xml:space="preserve">[9] Pölzler, Thomas (2021): Der verdrängte Tod. Philosophy Blog </w:t>
+        <w:t xml:space="preserve">[10] Pölzler, Thomas (2021): Der verdrängte Tod. Philosophy Blog </w:t>
       </w:r>
       <w:r>
         <w:rPr>
@@ -2827,7 +2850,7 @@
       </w:pPr>
       <w:r>
         <w:tab/>
-        <w:t xml:space="preserve">[10] Pölzler, Thomas; Namdar, Benedikt (2021): Wir stehen am Abgrund. </w:t>
+        <w:t xml:space="preserve">[11] Pölzler, Thomas; Namdar, Benedikt (2021): Wir stehen am Abgrund. </w:t>
       </w:r>
       <w:r>
         <w:rPr>
@@ -2850,7 +2873,7 @@
       </w:pPr>
       <w:r>
         <w:tab/>
-        <w:t xml:space="preserve">[11] Pölzler, Thomas (2020): Das Paradies muss warten. </w:t>
+        <w:t xml:space="preserve">[12] Pölzler, Thomas (2020): Das Paradies muss warten. </w:t>
       </w:r>
       <w:r>
         <w:rPr>
@@ -2873,7 +2896,7 @@
       </w:pPr>
       <w:r>
         <w:tab/>
-        <w:t xml:space="preserve">[12] Pölzler, Thomas (2020): Die andere Pest. Philosophy Blog </w:t>
+        <w:t xml:space="preserve">[13] Pölzler, Thomas (2020): Die andere Pest. Philosophy Blog </w:t>
       </w:r>
       <w:r>
         <w:rPr>
@@ -2896,7 +2919,7 @@
       </w:pPr>
       <w:r>
         <w:tab/>
-        <w:t xml:space="preserve">[13] Pölzler, Thomas; Namdar, Benedikt (2020): Who Should Save the Climate? </w:t>
+        <w:t xml:space="preserve">[14] Pölzler, Thomas; Namdar, Benedikt (2020): Who Should Save the Climate? </w:t>
       </w:r>
       <w:r>
         <w:rPr>
@@ -2919,7 +2942,7 @@
       </w:pPr>
       <w:r>
         <w:tab/>
-        <w:t xml:space="preserve">[14] Pölzler, Thomas (2020): Mehr Demut, weniger Moral. </w:t>
+        <w:t xml:space="preserve">[15] Pölzler, Thomas (2020): Mehr Demut, weniger Moral. </w:t>
       </w:r>
       <w:r>
         <w:rPr>
@@ -2942,7 +2965,7 @@
       </w:pPr>
       <w:r>
         <w:tab/>
-        <w:t xml:space="preserve">[15] Pölzler, Thomas (2019): Is Moral Relativism Really a Problem? </w:t>
+        <w:t xml:space="preserve">[16] Pölzler, Thomas (2019): Is Moral Relativism Really a Problem? </w:t>
       </w:r>
       <w:r>
         <w:rPr>
@@ -2965,7 +2988,7 @@
       </w:pPr>
       <w:r>
         <w:tab/>
-        <w:t xml:space="preserve">[16] Pölzler, Thomas (2019): Nun sag, wie hältst du’s mit der Moral? FWF Online Magazine </w:t>
+        <w:t xml:space="preserve">[17] Pölzler, Thomas (2019): Nun sag, wie hältst du’s mit der Moral? FWF Online Magazine </w:t>
       </w:r>
       <w:r>
         <w:rPr>
@@ -2988,7 +3011,7 @@
       </w:pPr>
       <w:r>
         <w:tab/>
-        <w:t xml:space="preserve">[17] Pölzler, Thomas (2019): Sich besser fühlen dank analytischer Philosophie. Philosophy Blog </w:t>
+        <w:t xml:space="preserve">[18] Pölzler, Thomas (2019): Sich besser fühlen dank analytischer Philosophie. Philosophy Blog </w:t>
       </w:r>
       <w:r>
         <w:rPr>
@@ -3011,7 +3034,7 @@
       </w:pPr>
       <w:r>
         <w:tab/>
-        <w:t xml:space="preserve">[18] Pölzler, Thomas (2019): Insufficient Effort Responding in Experimental Philosophy, Part II: Survey. </w:t>
+        <w:t xml:space="preserve">[19] Pölzler, Thomas (2019): Insufficient Effort Responding in Experimental Philosophy, Part II: Survey. </w:t>
       </w:r>
       <w:r>
         <w:rPr>
@@ -3034,7 +3057,7 @@
       </w:pPr>
       <w:r>
         <w:tab/>
-        <w:t xml:space="preserve">[19] Pölzler, Thomas (2019): Insufficient Effort Responding in Experimental Philosophy, Part I: Recommendations. </w:t>
+        <w:t xml:space="preserve">[20] Pölzler, Thomas (2019): Insufficient Effort Responding in Experimental Philosophy, Part I: Recommendations. </w:t>
       </w:r>
       <w:r>
         <w:rPr>
@@ -3057,7 +3080,7 @@
       </w:pPr>
       <w:r>
         <w:tab/>
-        <w:t xml:space="preserve">[20] Pölzler, Thomas (2018): Vertrauen ist gut, Kontrolle ist besser: Experimentelle Philosophie und die Qualität empirischer Daten. Philosophy Blog </w:t>
+        <w:t xml:space="preserve">[21] Pölzler, Thomas (2018): Vertrauen ist gut, Kontrolle ist besser: Experimentelle Philosophie und die Qualität empirischer Daten. Philosophy Blog </w:t>
       </w:r>
       <w:r>
         <w:rPr>

</xml_diff>

<commit_message>
Interview „Brain Circulation and Researcher Mobility“ (Austrian Information) von Media Coverage zu Science to Public verschoben, auf Website mit PDF
Co-Authored-By: Claude Opus 5.5 <noreply@anthropic.com>
Claude-Session: https://claude.ai/code/session_01T6qL9Nf94VqDwvmhDVCsFq
</commit_message>
<xml_diff>
--- a/cv/CV_Thomas_Poelzler.docx
+++ b/cv/CV_Thomas_Poelzler.docx
@@ -2873,7 +2873,30 @@
       </w:pPr>
       <w:r>
         <w:tab/>
-        <w:t xml:space="preserve">[12] Pölzler, Thomas (2020): Das Paradies muss warten. </w:t>
+        <w:t xml:space="preserve">[12] Pölzler, Thomas (2021): Interview in “Brain Circulation and Researcher Mobility.” </w:t>
+      </w:r>
+      <w:r>
+        <w:rPr>
+          <w:i/>
+          <w:iCs/>
+        </w:rPr>
+        <w:t xml:space="preserve">Austrian Information</w:t>
+      </w:r>
+      <w:r>
+        <w:t xml:space="preserve">, 01/06/2021.</w:t>
+      </w:r>
+    </w:p>
+    <w:p>
+      <w:pPr>
+        <w:tabs>
+          <w:tab w:val="left" w:pos="2126"/>
+        </w:tabs>
+        <w:spacing w:before="240" w:after="0" w:line="288" w:lineRule="auto"/>
+        <w:ind w:left="2126" w:hanging="2126"/>
+      </w:pPr>
+      <w:r>
+        <w:tab/>
+        <w:t xml:space="preserve">[13] Pölzler, Thomas (2020): Das Paradies muss warten. </w:t>
       </w:r>
       <w:r>
         <w:rPr>
@@ -2896,7 +2919,7 @@
       </w:pPr>
       <w:r>
         <w:tab/>
-        <w:t xml:space="preserve">[13] Pölzler, Thomas (2020): Die andere Pest. Philosophy Blog </w:t>
+        <w:t xml:space="preserve">[14] Pölzler, Thomas (2020): Die andere Pest. Philosophy Blog </w:t>
       </w:r>
       <w:r>
         <w:rPr>
@@ -2919,7 +2942,7 @@
       </w:pPr>
       <w:r>
         <w:tab/>
-        <w:t xml:space="preserve">[14] Pölzler, Thomas; Namdar, Benedikt (2020): Who Should Save the Climate? </w:t>
+        <w:t xml:space="preserve">[15] Pölzler, Thomas; Namdar, Benedikt (2020): Who Should Save the Climate? </w:t>
       </w:r>
       <w:r>
         <w:rPr>
@@ -2942,7 +2965,7 @@
       </w:pPr>
       <w:r>
         <w:tab/>
-        <w:t xml:space="preserve">[15] Pölzler, Thomas (2020): Mehr Demut, weniger Moral. </w:t>
+        <w:t xml:space="preserve">[16] Pölzler, Thomas (2020): Mehr Demut, weniger Moral. </w:t>
       </w:r>
       <w:r>
         <w:rPr>
@@ -2965,7 +2988,7 @@
       </w:pPr>
       <w:r>
         <w:tab/>
-        <w:t xml:space="preserve">[16] Pölzler, Thomas (2019): Is Moral Relativism Really a Problem? </w:t>
+        <w:t xml:space="preserve">[17] Pölzler, Thomas (2019): Is Moral Relativism Really a Problem? </w:t>
       </w:r>
       <w:r>
         <w:rPr>
@@ -2988,7 +3011,7 @@
       </w:pPr>
       <w:r>
         <w:tab/>
-        <w:t xml:space="preserve">[17] Pölzler, Thomas (2019): Nun sag, wie hältst du’s mit der Moral? FWF Online Magazine </w:t>
+        <w:t xml:space="preserve">[18] Pölzler, Thomas (2019): Nun sag, wie hältst du’s mit der Moral? FWF Online Magazine </w:t>
       </w:r>
       <w:r>
         <w:rPr>
@@ -3011,7 +3034,7 @@
       </w:pPr>
       <w:r>
         <w:tab/>
-        <w:t xml:space="preserve">[18] Pölzler, Thomas (2019): Sich besser fühlen dank analytischer Philosophie. Philosophy Blog </w:t>
+        <w:t xml:space="preserve">[19] Pölzler, Thomas (2019): Sich besser fühlen dank analytischer Philosophie. Philosophy Blog </w:t>
       </w:r>
       <w:r>
         <w:rPr>
@@ -3034,7 +3057,7 @@
       </w:pPr>
       <w:r>
         <w:tab/>
-        <w:t xml:space="preserve">[19] Pölzler, Thomas (2019): Insufficient Effort Responding in Experimental Philosophy, Part II: Survey. </w:t>
+        <w:t xml:space="preserve">[20] Pölzler, Thomas (2019): Insufficient Effort Responding in Experimental Philosophy, Part II: Survey. </w:t>
       </w:r>
       <w:r>
         <w:rPr>
@@ -3057,7 +3080,7 @@
       </w:pPr>
       <w:r>
         <w:tab/>
-        <w:t xml:space="preserve">[20] Pölzler, Thomas (2019): Insufficient Effort Responding in Experimental Philosophy, Part I: Recommendations. </w:t>
+        <w:t xml:space="preserve">[21] Pölzler, Thomas (2019): Insufficient Effort Responding in Experimental Philosophy, Part I: Recommendations. </w:t>
       </w:r>
       <w:r>
         <w:rPr>
@@ -3080,7 +3103,7 @@
       </w:pPr>
       <w:r>
         <w:tab/>
-        <w:t xml:space="preserve">[21] Pölzler, Thomas (2018): Vertrauen ist gut, Kontrolle ist besser: Experimentelle Philosophie und die Qualität empirischer Daten. Philosophy Blog </w:t>
+        <w:t xml:space="preserve">[22] Pölzler, Thomas (2018): Vertrauen ist gut, Kontrolle ist besser: Experimentelle Philosophie und die Qualität empirischer Daten. Philosophy Blog </w:t>
       </w:r>
       <w:r>
         <w:rPr>
@@ -6032,31 +6055,6 @@
       <w:r>
         <w:br/>
         <w:t xml:space="preserve">https://philosophie-gewi.uni-graz.at/de/praktische-philosophie/neuigkeiten/detail/article/wir-gratulieren-herrn-poelzler-zum-erhalt-des-wolfang-stegmueller-preises-1/</w:t>
-      </w:r>
-    </w:p>
-    <w:p>
-      <w:pPr>
-        <w:tabs>
-          <w:tab w:val="left" w:pos="2126"/>
-        </w:tabs>
-        <w:spacing w:before="240" w:after="0" w:line="288" w:lineRule="auto"/>
-        <w:ind w:left="2126" w:hanging="2126"/>
-      </w:pPr>
-      <w:r>
-        <w:t xml:space="preserve">01/26/2021</w:t>
-        <w:tab/>
-        <w:t xml:space="preserve">Brain Circulation and Researcher Mobility | </w:t>
-      </w:r>
-      <w:r>
-        <w:rPr>
-          <w:i/>
-          <w:iCs/>
-        </w:rPr>
-        <w:t xml:space="preserve">Austrian Information</w:t>
-      </w:r>
-      <w:r>
-        <w:br/>
-        <w:t xml:space="preserve">https://www.austrianinformation.org/education-science-research/brain-circulation-and-researcher-mobility</w:t>
       </w:r>
     </w:p>
     <w:p>

</xml_diff>

<commit_message>
Neue Publikation: Doomsday and You (Knutzen et al., Synthese, forthcoming) – Website und CV
Co-Authored-By: Claude Opus 5.5 <noreply@anthropic.com>
Claude-Session: https://claude.ai/code/session_01T6qL9Nf94VqDwvmhDVCsFq
</commit_message>
<xml_diff>
--- a/cv/CV_Thomas_Poelzler.docx
+++ b/cv/CV_Thomas_Poelzler.docx
@@ -1209,7 +1209,30 @@
       <w:r>
         <w:t xml:space="preserve">Journal Articles</w:t>
         <w:tab/>
-        <w:t xml:space="preserve">[1] Pölzler, Thomas; Tomabechi, Tobu; Suzuki, Takayuki (forthcoming): Lay People Deny Morality’s Objectivity across Cultures (to somewhat Different Extents and in somewhat Different Ways). </w:t>
+        <w:t xml:space="preserve">[1] Knutzen, Jonathan; Köstenbaumer, Daniel; Hopster, Jeroen; Pölzler, Thomas (forthcoming): Doomsday and You: The Effect of Contemplating Existential Risk on Life and Activity Evaluation. </w:t>
+      </w:r>
+      <w:r>
+        <w:rPr>
+          <w:i/>
+          <w:iCs/>
+        </w:rPr>
+        <w:t xml:space="preserve">Synthese</w:t>
+      </w:r>
+      <w:r>
+        <w:t xml:space="preserve">.</w:t>
+      </w:r>
+    </w:p>
+    <w:p>
+      <w:pPr>
+        <w:tabs>
+          <w:tab w:val="left" w:pos="2126"/>
+        </w:tabs>
+        <w:spacing w:before="240" w:after="0" w:line="288" w:lineRule="auto"/>
+        <w:ind w:left="2126" w:hanging="2126"/>
+      </w:pPr>
+      <w:r>
+        <w:tab/>
+        <w:t xml:space="preserve">[2] Pölzler, Thomas; Tomabechi, Tobu; Suzuki, Takayuki (forthcoming): Lay People Deny Morality’s Objectivity across Cultures (to somewhat Different Extents and in somewhat Different Ways). </w:t>
       </w:r>
       <w:r>
         <w:rPr>
@@ -1232,7 +1255,7 @@
       </w:pPr>
       <w:r>
         <w:tab/>
-        <w:t xml:space="preserve">[2] Pölzler, Thomas (2025): How to Do Empirical Political Philosophy: A Case Study of Miller’s Argument for Needs-Based Justice. </w:t>
+        <w:t xml:space="preserve">[3] Pölzler, Thomas (2025): How to Do Empirical Political Philosophy: A Case Study of Miller’s Argument for Needs-Based Justice. </w:t>
       </w:r>
       <w:r>
         <w:rPr>
@@ -1255,7 +1278,7 @@
       </w:pPr>
       <w:r>
         <w:tab/>
-        <w:t xml:space="preserve">[3] Pölzler, Thomas; Tomabechi, Tobu; Hannikainen, Ivar R. (2024): Broad, Subjective, Relative: The Surprising Folk Concept of Basic Needs. </w:t>
+        <w:t xml:space="preserve">[4] Pölzler, Thomas; Tomabechi, Tobu; Hannikainen, Ivar R. (2024): Broad, Subjective, Relative: The Surprising Folk Concept of Basic Needs. </w:t>
       </w:r>
       <w:r>
         <w:rPr>
@@ -1278,7 +1301,7 @@
       </w:pPr>
       <w:r>
         <w:tab/>
-        <w:t xml:space="preserve">[4] Pölzler, Thomas; Zijlstra, Lieuwe; Dijkstra, Jacob (2024): Moral Progress, Knowledge and Error: Do People Believe in Moral Objectivity? </w:t>
+        <w:t xml:space="preserve">[5] Pölzler, Thomas; Zijlstra, Lieuwe; Dijkstra, Jacob (2024): Moral Progress, Knowledge and Error: Do People Believe in Moral Objectivity? </w:t>
       </w:r>
       <w:r>
         <w:rPr>
@@ -1301,7 +1324,7 @@
       </w:pPr>
       <w:r>
         <w:tab/>
-        <w:t xml:space="preserve">[5] Pölzler, Thomas; Paulo, Norbert (2024): Thought Experiments and Experimental Ethics. </w:t>
+        <w:t xml:space="preserve">[6] Pölzler, Thomas; Paulo, Norbert (2024): Thought Experiments and Experimental Ethics. </w:t>
       </w:r>
       <w:r>
         <w:rPr>
@@ -1336,7 +1359,7 @@
       </w:pPr>
       <w:r>
         <w:tab/>
-        <w:t xml:space="preserve">[6] Wagner, Johannes; Pölzler, Thomas; Wright, Jennifer C. (2023): Implicit Metaethical Intuitions: Validating and Employing a New IAT Procedure. </w:t>
+        <w:t xml:space="preserve">[7] Wagner, Johannes; Pölzler, Thomas; Wright, Jennifer C. (2023): Implicit Metaethical Intuitions: Validating and Employing a New IAT Procedure. </w:t>
       </w:r>
       <w:r>
         <w:rPr>
@@ -1359,7 +1382,7 @@
       </w:pPr>
       <w:r>
         <w:tab/>
-        <w:t xml:space="preserve">[7] Pölzler, Thomas; Wright, Jennifer C. (2023): An Empirical Argument against Moral Non-Cognitivism. </w:t>
+        <w:t xml:space="preserve">[8] Pölzler, Thomas; Wright, Jennifer C. (2023): An Empirical Argument against Moral Non-Cognitivism. </w:t>
       </w:r>
       <w:r>
         <w:rPr>
@@ -1382,7 +1405,7 @@
       </w:pPr>
       <w:r>
         <w:tab/>
-        <w:t xml:space="preserve">[8] Pölzler, Thomas; Hannikainen, Ivar R. (2022): The Typicality Effect in Basic Needs. </w:t>
+        <w:t xml:space="preserve">[9] Pölzler, Thomas; Hannikainen, Ivar R. (2022): The Typicality Effect in Basic Needs. </w:t>
       </w:r>
       <w:r>
         <w:rPr>
@@ -1405,7 +1428,7 @@
       </w:pPr>
       <w:r>
         <w:tab/>
-        <w:t xml:space="preserve">[9] Pölzler, Thomas; Ortner, Florian; Meyer, Lukas; Sass, Oliver; Hofer, Miriam (2022): Natural Hazards under Climate Change Conditions: A Case Study of Expectations and their Normative Significance in Protecting Alpine Communities. </w:t>
+        <w:t xml:space="preserve">[10] Pölzler, Thomas; Ortner, Florian; Meyer, Lukas; Sass, Oliver; Hofer, Miriam (2022): Natural Hazards under Climate Change Conditions: A Case Study of Expectations and their Normative Significance in Protecting Alpine Communities. </w:t>
       </w:r>
       <w:r>
         <w:rPr>
@@ -1428,7 +1451,7 @@
       </w:pPr>
       <w:r>
         <w:tab/>
-        <w:t xml:space="preserve">[10] Wright, Jennifer C.; Pölzler, Thomas (2022): Should Morality be Abolished? An Empirical Challenge to the Argument from Intolerance. </w:t>
+        <w:t xml:space="preserve">[11] Wright, Jennifer C.; Pölzler, Thomas (2022): Should Morality be Abolished? An Empirical Challenge to the Argument from Intolerance. </w:t>
       </w:r>
       <w:r>
         <w:rPr>
@@ -1451,7 +1474,7 @@
       </w:pPr>
       <w:r>
         <w:tab/>
-        <w:t xml:space="preserve">[11] Pölzler, Thomas (2021): The Relativistic Car: Applying Metaethics to the Debate about Self-Driving Vehicles. </w:t>
+        <w:t xml:space="preserve">[12] Pölzler, Thomas (2021): The Relativistic Car: Applying Metaethics to the Debate about Self-Driving Vehicles. </w:t>
       </w:r>
       <w:r>
         <w:rPr>
@@ -1474,7 +1497,7 @@
       </w:pPr>
       <w:r>
         <w:tab/>
-        <w:t xml:space="preserve">[12] Pölzler, Thomas (2021): Basic Needs in Normative Contexts. </w:t>
+        <w:t xml:space="preserve">[13] Pölzler, Thomas (2021): Basic Needs in Normative Contexts. </w:t>
       </w:r>
       <w:r>
         <w:rPr>
@@ -1509,7 +1532,7 @@
       </w:pPr>
       <w:r>
         <w:tab/>
-        <w:t xml:space="preserve">[13] Pölzler, Thomas (2020): Against Overgeneralization Objections to the Argument from Moral Disagreement. </w:t>
+        <w:t xml:space="preserve">[14] Pölzler, Thomas (2020): Against Overgeneralization Objections to the Argument from Moral Disagreement. </w:t>
       </w:r>
       <w:r>
         <w:rPr>
@@ -1532,7 +1555,7 @@
       </w:pPr>
       <w:r>
         <w:tab/>
-        <w:t xml:space="preserve">[14] Paulo, Norbert; Pölzler, Thomas (2020): X-Phi and Impartiality Thought Experiments: Investigating the Veil of Ignorance. </w:t>
+        <w:t xml:space="preserve">[15] Paulo, Norbert; Pölzler, Thomas (2020): X-Phi and Impartiality Thought Experiments: Investigating the Veil of Ignorance. </w:t>
       </w:r>
       <w:r>
         <w:rPr>
@@ -1555,7 +1578,7 @@
       </w:pPr>
       <w:r>
         <w:tab/>
-        <w:t xml:space="preserve">[15] Pölzler, Thomas; Wright, Jennifer C. (2020): Anti-Realist Pluralism: A New Approach to Folk Metaethics. </w:t>
+        <w:t xml:space="preserve">[16] Pölzler, Thomas; Wright, Jennifer C. (2020): Anti-Realist Pluralism: A New Approach to Folk Metaethics. </w:t>
       </w:r>
       <w:r>
         <w:rPr>
@@ -1578,7 +1601,7 @@
       </w:pPr>
       <w:r>
         <w:tab/>
-        <w:t xml:space="preserve">[16] Pölzler, Thomas (2020): Camus on the Value of Art. </w:t>
+        <w:t xml:space="preserve">[17] Pölzler, Thomas (2020): Camus on the Value of Art. </w:t>
       </w:r>
       <w:r>
         <w:rPr>
@@ -1613,7 +1636,7 @@
       </w:pPr>
       <w:r>
         <w:tab/>
-        <w:t xml:space="preserve">[17] Pölzler, Thomas; Wright, Jennifer C. (2019): Empirical Research on Folk Moral Objectivism. </w:t>
+        <w:t xml:space="preserve">[18] Pölzler, Thomas; Wright, Jennifer C. (2019): Empirical Research on Folk Moral Objectivism. </w:t>
       </w:r>
       <w:r>
         <w:rPr>
@@ -1636,7 +1659,7 @@
       </w:pPr>
       <w:r>
         <w:tab/>
-        <w:t xml:space="preserve">[18] Pölzler, Thomas (2019): Open Borders and the Ideality of Approaches: An Analysis of Joseph Carens’ Critique of the Conventional View regarding Immigration. </w:t>
+        <w:t xml:space="preserve">[19] Pölzler, Thomas (2019): Open Borders and the Ideality of Approaches: An Analysis of Joseph Carens’ Critique of the Conventional View regarding Immigration. </w:t>
       </w:r>
       <w:r>
         <w:rPr>
@@ -1659,7 +1682,7 @@
       </w:pPr>
       <w:r>
         <w:tab/>
-        <w:t xml:space="preserve">[19] Pölzler, Thomas (2019): How to Determine whether Evolution Debunks Moral Realism. </w:t>
+        <w:t xml:space="preserve">[20] Pölzler, Thomas (2019): How to Determine whether Evolution Debunks Moral Realism. </w:t>
       </w:r>
       <w:r>
         <w:rPr>
@@ -1682,7 +1705,7 @@
       </w:pPr>
       <w:r>
         <w:tab/>
-        <w:t xml:space="preserve">[20] Pölzler, Thomas (2018): Entschädigung für historisches Unrecht: Das Argument des anhaltenden Unrechts. </w:t>
+        <w:t xml:space="preserve">[21] Pölzler, Thomas (2018): Entschädigung für historisches Unrecht: Das Argument des anhaltenden Unrechts. </w:t>
       </w:r>
       <w:r>
         <w:rPr>
@@ -1705,7 +1728,7 @@
       </w:pPr>
       <w:r>
         <w:tab/>
-        <w:t xml:space="preserve">[21] Pölzler, Thomas (2018): How to Measure Moral Realism. </w:t>
+        <w:t xml:space="preserve">[22] Pölzler, Thomas (2018): How to Measure Moral Realism. </w:t>
       </w:r>
       <w:r>
         <w:rPr>
@@ -1728,7 +1751,7 @@
       </w:pPr>
       <w:r>
         <w:tab/>
-        <w:t xml:space="preserve">[22] Pölzler, Thomas (2018): Can the Empirical Sciences Contribute to the Moral Realism/Anti-Realism Debate? </w:t>
+        <w:t xml:space="preserve">[23] Pölzler, Thomas (2018): Can the Empirical Sciences Contribute to the Moral Realism/Anti-Realism Debate? </w:t>
       </w:r>
       <w:r>
         <w:rPr>
@@ -1751,7 +1774,7 @@
       </w:pPr>
       <w:r>
         <w:tab/>
-        <w:t xml:space="preserve">[23] Pölzler, Thomas (2018): Camus’ Feeling of the Absurd. </w:t>
+        <w:t xml:space="preserve">[24] Pölzler, Thomas (2018): Camus’ Feeling of the Absurd. </w:t>
       </w:r>
       <w:r>
         <w:rPr>
@@ -1774,7 +1797,7 @@
       </w:pPr>
       <w:r>
         <w:tab/>
-        <w:t xml:space="preserve">[24] Pölzler, Thomas (2017): On the Contribution of Philosophical and Geoscientific Inquiry to Geoethics (</w:t>
+        <w:t xml:space="preserve">[25] Pölzler, Thomas (2017): On the Contribution of Philosophical and Geoscientific Inquiry to Geoethics (</w:t>
       </w:r>
       <w:r>
         <w:rPr>
@@ -1807,7 +1830,7 @@
       </w:pPr>
       <w:r>
         <w:tab/>
-        <w:t xml:space="preserve">[25] Pölzler, Thomas; Ortner, Florian (2017): Ethical but Upsetting Geoscience Research: A Case Study. </w:t>
+        <w:t xml:space="preserve">[26] Pölzler, Thomas; Ortner, Florian (2017): Ethical but Upsetting Geoscience Research: A Case Study. </w:t>
       </w:r>
       <w:r>
         <w:rPr>
@@ -1830,7 +1853,7 @@
       </w:pPr>
       <w:r>
         <w:tab/>
-        <w:t xml:space="preserve">[26] Pölzler, Thomas (2017): Are Moral Judgements Adaptations? Three Reasons Why It Is so Difficult to Tell. </w:t>
+        <w:t xml:space="preserve">[27] Pölzler, Thomas (2017): Are Moral Judgements Adaptations? Three Reasons Why It Is so Difficult to Tell. </w:t>
       </w:r>
       <w:r>
         <w:rPr>
@@ -1853,7 +1876,7 @@
       </w:pPr>
       <w:r>
         <w:tab/>
-        <w:t xml:space="preserve">[27] Pölzler, Thomas (2017): Revisiting Folk Moral Realism. </w:t>
+        <w:t xml:space="preserve">[28] Pölzler, Thomas (2017): Revisiting Folk Moral Realism. </w:t>
       </w:r>
       <w:r>
         <w:rPr>
@@ -1876,7 +1899,7 @@
       </w:pPr>
       <w:r>
         <w:tab/>
-        <w:t xml:space="preserve">[28] Pölzler, Thomas (2016): Further Problems with Projectivism. </w:t>
+        <w:t xml:space="preserve">[29] Pölzler, Thomas (2016): Further Problems with Projectivism. </w:t>
       </w:r>
       <w:r>
         <w:rPr>
@@ -1899,7 +1922,7 @@
       </w:pPr>
       <w:r>
         <w:tab/>
-        <w:t xml:space="preserve">[29] Pölzler, Thomas (2016): Wie schlüssig ist Albert Camus’ frühe Logik des Absurden? </w:t>
+        <w:t xml:space="preserve">[30] Pölzler, Thomas (2016): Wie schlüssig ist Albert Camus’ frühe Logik des Absurden? </w:t>
       </w:r>
       <w:r>
         <w:rPr>
@@ -1922,7 +1945,7 @@
       </w:pPr>
       <w:r>
         <w:tab/>
-        <w:t xml:space="preserve">[30] Pölzler, Thomas (2015): Moral Judgements and Emotions: A Less Intimate Relationship than Recently Claimed. </w:t>
+        <w:t xml:space="preserve">[31] Pölzler, Thomas (2015): Moral Judgements and Emotions: A Less Intimate Relationship than Recently Claimed. </w:t>
       </w:r>
       <w:r>
         <w:rPr>
@@ -1945,7 +1968,7 @@
       </w:pPr>
       <w:r>
         <w:tab/>
-        <w:t xml:space="preserve">[31] Pölzler, Thomas (2015): Climate Change Inaction and Moral Nihilism. </w:t>
+        <w:t xml:space="preserve">[32] Pölzler, Thomas (2015): Climate Change Inaction and Moral Nihilism. </w:t>
       </w:r>
       <w:r>
         <w:rPr>
@@ -1968,7 +1991,7 @@
       </w:pPr>
       <w:r>
         <w:tab/>
-        <w:t xml:space="preserve">[32] Pölzler, Thomas (2014): Absurdism as Self-Help: Resolving an Essential Inconsistency in Camus’ Early Philosophy. </w:t>
+        <w:t xml:space="preserve">[33] Pölzler, Thomas (2014): Absurdism as Self-Help: Resolving an Essential Inconsistency in Camus’ Early Philosophy. </w:t>
       </w:r>
       <w:r>
         <w:rPr>
@@ -1991,7 +2014,7 @@
       </w:pPr>
       <w:r>
         <w:tab/>
-        <w:t xml:space="preserve">[33] Pölzler, Thomas (2011): Camus’ Early “Logic of the Absurd”. </w:t>
+        <w:t xml:space="preserve">[34] Pölzler, Thomas (2011): Camus’ Early “Logic of the Absurd”. </w:t>
       </w:r>
       <w:r>
         <w:rPr>

</xml_diff>

<commit_message>
„Philosophy Blog praefaktisch.de“ durch „Praefaktisch“ ersetzt (Outreach und CV)
Co-Authored-By: Claude Opus 5.5 <noreply@anthropic.com>
Claude-Session: https://claude.ai/code/session_01T6qL9Nf94VqDwvmhDVCsFq
</commit_message>
<xml_diff>
--- a/cv/CV_Thomas_Poelzler.docx
+++ b/cv/CV_Thomas_Poelzler.docx
@@ -2689,14 +2689,14 @@
       </w:pPr>
       <w:r>
         <w:tab/>
-        <w:t xml:space="preserve">[3] Pölzler, Thomas (2026): Wieso Meursault? Ein Mord als Lehrstück des Absurden. Philosophy Blog </w:t>
-      </w:r>
-      <w:r>
-        <w:rPr>
-          <w:i/>
-          <w:iCs/>
-        </w:rPr>
-        <w:t xml:space="preserve">praefaktisch.de</w:t>
+        <w:t xml:space="preserve">[3] Pölzler, Thomas (2026): Wieso Meursault? Ein Mord als Lehrstück des Absurden. </w:t>
+      </w:r>
+      <w:r>
+        <w:rPr>
+          <w:i/>
+          <w:iCs/>
+        </w:rPr>
+        <w:t xml:space="preserve">Praefaktisch</w:t>
       </w:r>
       <w:r>
         <w:t xml:space="preserve">.</w:t>
@@ -2850,14 +2850,14 @@
       </w:pPr>
       <w:r>
         <w:tab/>
-        <w:t xml:space="preserve">[10] Pölzler, Thomas (2021): Der verdrängte Tod. Philosophy Blog </w:t>
-      </w:r>
-      <w:r>
-        <w:rPr>
-          <w:i/>
-          <w:iCs/>
-        </w:rPr>
-        <w:t xml:space="preserve">praefaktisch.de</w:t>
+        <w:t xml:space="preserve">[10] Pölzler, Thomas (2021): Der verdrängte Tod. </w:t>
+      </w:r>
+      <w:r>
+        <w:rPr>
+          <w:i/>
+          <w:iCs/>
+        </w:rPr>
+        <w:t xml:space="preserve">Praefaktisch</w:t>
       </w:r>
       <w:r>
         <w:t xml:space="preserve">.</w:t>
@@ -2942,14 +2942,14 @@
       </w:pPr>
       <w:r>
         <w:tab/>
-        <w:t xml:space="preserve">[14] Pölzler, Thomas (2020): Die andere Pest. Philosophy Blog </w:t>
-      </w:r>
-      <w:r>
-        <w:rPr>
-          <w:i/>
-          <w:iCs/>
-        </w:rPr>
-        <w:t xml:space="preserve">praefaktisch.de</w:t>
+        <w:t xml:space="preserve">[14] Pölzler, Thomas (2020): Die andere Pest. </w:t>
+      </w:r>
+      <w:r>
+        <w:rPr>
+          <w:i/>
+          <w:iCs/>
+        </w:rPr>
+        <w:t xml:space="preserve">Praefaktisch</w:t>
       </w:r>
       <w:r>
         <w:t xml:space="preserve">.</w:t>
@@ -3057,14 +3057,14 @@
       </w:pPr>
       <w:r>
         <w:tab/>
-        <w:t xml:space="preserve">[19] Pölzler, Thomas (2019): Sich besser fühlen dank analytischer Philosophie. Philosophy Blog </w:t>
-      </w:r>
-      <w:r>
-        <w:rPr>
-          <w:i/>
-          <w:iCs/>
-        </w:rPr>
-        <w:t xml:space="preserve">praefaktisch.de</w:t>
+        <w:t xml:space="preserve">[19] Pölzler, Thomas (2019): Sich besser fühlen dank analytischer Philosophie. </w:t>
+      </w:r>
+      <w:r>
+        <w:rPr>
+          <w:i/>
+          <w:iCs/>
+        </w:rPr>
+        <w:t xml:space="preserve">Praefaktisch</w:t>
       </w:r>
       <w:r>
         <w:t xml:space="preserve">.</w:t>
@@ -3126,14 +3126,14 @@
       </w:pPr>
       <w:r>
         <w:tab/>
-        <w:t xml:space="preserve">[22] Pölzler, Thomas (2018): Vertrauen ist gut, Kontrolle ist besser: Experimentelle Philosophie und die Qualität empirischer Daten. Philosophy Blog </w:t>
-      </w:r>
-      <w:r>
-        <w:rPr>
-          <w:i/>
-          <w:iCs/>
-        </w:rPr>
-        <w:t xml:space="preserve">praefaktisch.de</w:t>
+        <w:t xml:space="preserve">[22] Pölzler, Thomas (2018): Vertrauen ist gut, Kontrolle ist besser: Experimentelle Philosophie und die Qualität empirischer Daten. </w:t>
+      </w:r>
+      <w:r>
+        <w:rPr>
+          <w:i/>
+          <w:iCs/>
+        </w:rPr>
+        <w:t xml:space="preserve">Praefaktisch</w:t>
       </w:r>
       <w:r>
         <w:t xml:space="preserve">.</w:t>

</xml_diff>

<commit_message>
„(xphiblog.com)“ auf Outreach und im CV entfernt
Co-Authored-By: Claude Opus 5.5 <noreply@anthropic.com>
Claude-Session: https://claude.ai/code/session_01T6qL9Nf94VqDwvmhDVCsFq
</commit_message>
<xml_diff>
--- a/cv/CV_Thomas_Poelzler.docx
+++ b/cv/CV_Thomas_Poelzler.docx
@@ -3090,7 +3090,7 @@
         <w:t xml:space="preserve">The New Experimental Philosophy Blog</w:t>
       </w:r>
       <w:r>
-        <w:t xml:space="preserve"> (xphiblog.com).</w:t>
+        <w:t xml:space="preserve">.</w:t>
       </w:r>
     </w:p>
     <w:p>
@@ -3113,7 +3113,7 @@
         <w:t xml:space="preserve">The New Experimental Philosophy Blog</w:t>
       </w:r>
       <w:r>
-        <w:t xml:space="preserve"> (xphiblog.com).</w:t>
+        <w:t xml:space="preserve">.</w:t>
       </w:r>
     </w:p>
     <w:p>

</xml_diff>